<commit_message>
Simplify sustainability KPI examples for clarity
</commit_message>
<xml_diff>
--- a/APC-2026-Diamante-Sustainability-KPIs-SDG.docx
+++ b/APC-2026-Diamante-Sustainability-KPIs-SDG.docx
@@ -702,7 +702,7 @@
         <w:rPr>
           <w:sz w:val="19"/>
         </w:rPr>
-        <w:t>Petra targets a 35–40% cut in Scope 1 &amp; 2 by 2030 against a 2019 baseline, and net zero by 2050. If the 2019 baseline were 200 000 tCO2e, the 2030 target is about 120 000–130 000 tCO2e.</w:t>
+        <w:t>Imagine the mine gave off 100 tonnes of carbon in 2019. A 35–40% cut means getting down to about 60–65 tonnes by 2030 — which is exactly Diamante’s goal.</w:t>
       </w:r>
     </w:p>
     <w:p>
@@ -841,7 +841,7 @@
         <w:rPr>
           <w:sz w:val="19"/>
         </w:rPr>
-        <w:t>If a company uses 150 GWh in total and 30 GWh is renewable, the renewable share is 30 ÷ 150 = 20%.</w:t>
+        <w:t>If 2 out of every 10 units of electricity come from solar, that is 20% renewable.</w:t>
       </w:r>
     </w:p>
     <w:p>
@@ -980,7 +980,7 @@
         <w:rPr>
           <w:sz w:val="19"/>
         </w:rPr>
-        <w:t>If 10 million m³ of water is used and 8 million m³ is recycled, the recycled share is 8 ÷ 10 = 80%.</w:t>
+        <w:t>If a mine uses 10 buckets of water and reuses 8 of them, it has recycled 80%.</w:t>
       </w:r>
     </w:p>
     <w:p>
@@ -1119,7 +1119,7 @@
         <w:rPr>
           <w:sz w:val="19"/>
         </w:rPr>
-        <w:t>If 100 hectares have been disturbed and 60 hectares rehabilitated, the rehabilitation rate is 60%.</w:t>
+        <w:t>If the mine dug up 10 fields of land and has replanted 6 of them, it has rehabilitated 60%.</w:t>
       </w:r>
     </w:p>
     <w:p>
@@ -1272,7 +1272,7 @@
         <w:rPr>
           <w:sz w:val="19"/>
         </w:rPr>
-        <w:t>Petra had 10 lost-time injuries and an LTIFR of 0.16 in FY2024 (implying about 62.5 million hours worked), and the rate rose to 0.28 in FY2025.</w:t>
+        <w:t>If workers put in 1 000 000 hours and there were 2 lost-time injuries, the LTIFR is 2. Petra’s is 0.28, which is roughly one injury for every 3.5 million hours worked.</w:t>
       </w:r>
     </w:p>
     <w:p>
@@ -1411,7 +1411,7 @@
         <w:rPr>
           <w:sz w:val="19"/>
         </w:rPr>
-        <w:t>If 4 500 of 5 000 employees are covered by HIV and TB screening, coverage is 90%.</w:t>
+        <w:t>If 9 out of every 10 employees have been screened for HIV and TB, coverage is 90%.</w:t>
       </w:r>
     </w:p>
     <w:p>
@@ -1550,7 +1550,7 @@
         <w:rPr>
           <w:sz w:val="19"/>
         </w:rPr>
-        <w:t>If 4 000 of 5 000 employees are from host communities, local employment is 80%.</w:t>
+        <w:t>If 8 out of every 10 workers come from the nearby towns, local employment is 80%.</w:t>
       </w:r>
     </w:p>
     <w:p>
@@ -1689,7 +1689,7 @@
         <w:rPr>
           <w:sz w:val="19"/>
         </w:rPr>
-        <w:t>If there are 750 women in a workforce of 5 000, women make up 15%.</w:t>
+        <w:t>If 15 out of every 100 employees are women, that is 15%.</w:t>
       </w:r>
     </w:p>
     <w:p>
@@ -1842,7 +1842,7 @@
         <w:rPr>
           <w:sz w:val="19"/>
         </w:rPr>
-        <w:t>If R20m is spent on community projects out of R400m pre-tax profit, CSI is 5% of profit (in a profitable year).</w:t>
+        <w:t>If the company makes R100 of profit and spends R5 helping local communities, that is 5% of its profit.</w:t>
       </w:r>
     </w:p>
     <w:p>
@@ -1981,7 +1981,7 @@
         <w:rPr>
           <w:sz w:val="19"/>
         </w:rPr>
-        <w:t>If 100% of production is Kimberley-Process certified and there are zero incidents, the KPI is fully met.</w:t>
+        <w:t>If every single diamond sold can be traced and certified conflict-free, the KPI is 100%.</w:t>
       </w:r>
     </w:p>
     <w:p>

</xml_diff>